<commit_message>
court(wva): petition-for-writ gated, docx reported (fb-595.54.21)
The keyed authorities carry the filed table's order as sort keys, so typst and
LaTeX list them alike (737/737 lines); no printed word changed. LibreOffice's
note placement on p9 is reported (B6) (fb-595.54.21).

Co-Authored-By: Claude Opus 5.5 <noreply@anthropic.com>
</commit_message>
<xml_diff>
--- a/courts/fourth-circuit/west-virginia/state/supreme-court/petition-for-writ/usage/OUTPUT-petition-for-writ.docx
+++ b/courts/fourth-circuit/west-virginia/state/supreme-court/petition-for-writ/usage/OUTPUT-petition-for-writ.docx
@@ -3404,6 +3404,203 @@
           <w:tab w:val="right" w:leader="dot" w:pos="9360"/>
         </w:tabs>
         <w:spacing w:before="144" w:after="0" w:line="276" w:lineRule="exact"/>
+        <w:ind w:left="576" w:right="1120" w:hanging="576"/>
+      </w:pPr>
+      <w:r>
+        <w:rPr>
+          <w:i/>
+          <w:iCs/>
+        </w:rPr>
+        <w:t xml:space="preserve">State</w:t>
+      </w:r>
+      <w:r>
+        <w:rPr>
+          <w:i/>
+          <w:iCs/>
+        </w:rPr>
+        <w:t xml:space="preserve"> </w:t>
+      </w:r>
+      <w:r>
+        <w:rPr>
+          <w:i/>
+          <w:iCs/>
+        </w:rPr>
+        <w:t xml:space="preserve">ex</w:t>
+      </w:r>
+      <w:r>
+        <w:rPr>
+          <w:i/>
+          <w:iCs/>
+        </w:rPr>
+        <w:t xml:space="preserve"> </w:t>
+      </w:r>
+      <w:r>
+        <w:rPr>
+          <w:i/>
+          <w:iCs/>
+        </w:rPr>
+        <w:t xml:space="preserve">rel</w:t>
+      </w:r>
+      <w:r>
+        <w:rPr>
+          <w:i/>
+          <w:iCs/>
+        </w:rPr>
+        <w:t xml:space="preserve"> </w:t>
+      </w:r>
+      <w:r>
+        <w:rPr>
+          <w:i/>
+          <w:iCs/>
+        </w:rPr>
+        <w:t xml:space="preserve">Primecare</w:t>
+      </w:r>
+      <w:r>
+        <w:rPr>
+          <w:i/>
+          <w:iCs/>
+        </w:rPr>
+        <w:t xml:space="preserve"> </w:t>
+      </w:r>
+      <w:r>
+        <w:rPr>
+          <w:i/>
+          <w:iCs/>
+        </w:rPr>
+        <w:t xml:space="preserve">Med.</w:t>
+      </w:r>
+      <w:r>
+        <w:rPr>
+          <w:i/>
+          <w:iCs/>
+        </w:rPr>
+        <w:t xml:space="preserve"> </w:t>
+      </w:r>
+      <w:r>
+        <w:rPr>
+          <w:i/>
+          <w:iCs/>
+        </w:rPr>
+        <w:t xml:space="preserve">Of</w:t>
+      </w:r>
+      <w:r>
+        <w:rPr>
+          <w:i/>
+          <w:iCs/>
+        </w:rPr>
+        <w:t xml:space="preserve"> </w:t>
+      </w:r>
+      <w:r>
+        <w:rPr>
+          <w:i/>
+          <w:iCs/>
+        </w:rPr>
+        <w:t xml:space="preserve">W.Va.,</w:t>
+      </w:r>
+      <w:r>
+        <w:rPr>
+          <w:i/>
+          <w:iCs/>
+        </w:rPr>
+        <w:t xml:space="preserve"> </w:t>
+      </w:r>
+      <w:r>
+        <w:rPr>
+          <w:i/>
+          <w:iCs/>
+        </w:rPr>
+        <w:t xml:space="preserve">Inc.</w:t>
+      </w:r>
+      <w:r>
+        <w:rPr>
+          <w:i/>
+          <w:iCs/>
+        </w:rPr>
+        <w:t xml:space="preserve"> </w:t>
+      </w:r>
+      <w:r>
+        <w:rPr>
+          <w:i/>
+          <w:iCs/>
+        </w:rPr>
+        <w:t xml:space="preserve">v.</w:t>
+      </w:r>
+      <w:r>
+        <w:rPr>
+          <w:i/>
+          <w:iCs/>
+        </w:rPr>
+        <w:t xml:space="preserve"> </w:t>
+      </w:r>
+      <w:r>
+        <w:rPr>
+          <w:i/>
+          <w:iCs/>
+        </w:rPr>
+        <w:t xml:space="preserve">Faircloth</w:t>
+      </w:r>
+      <w:r>
+        <w:t xml:space="preserve">,</w:t>
+      </w:r>
+      <w:r>
+        <w:t xml:space="preserve"> </w:t>
+      </w:r>
+      <w:r>
+        <w:t xml:space="preserve">242</w:t>
+      </w:r>
+      <w:r>
+        <w:t xml:space="preserve"> </w:t>
+      </w:r>
+      <w:r>
+        <w:t xml:space="preserve">W.Va.</w:t>
+      </w:r>
+      <w:r>
+        <w:t xml:space="preserve"> </w:t>
+      </w:r>
+      <w:r>
+        <w:t xml:space="preserve">335,</w:t>
+      </w:r>
+      <w:r>
+        <w:t xml:space="preserve"> </w:t>
+      </w:r>
+      <w:r>
+        <w:t xml:space="preserve">835</w:t>
+      </w:r>
+      <w:r>
+        <w:t xml:space="preserve"> </w:t>
+      </w:r>
+      <w:r>
+        <w:t xml:space="preserve">S.E.2d</w:t>
+      </w:r>
+      <w:r>
+        <w:t xml:space="preserve"> </w:t>
+      </w:r>
+      <w:r>
+        <w:t xml:space="preserve">579</w:t>
+      </w:r>
+      <w:r>
+        <w:t xml:space="preserve"> </w:t>
+      </w:r>
+      <w:r>
+        <w:t xml:space="preserve">(2019)</w:t>
+      </w:r>
+      <w:r>
+        <w:t xml:space="preserve">   </w:t>
+      </w:r>
+      <w:r>
+        <w:tab/>
+      </w:r>
+      <w:r>
+        <w:t xml:space="preserve">7, 11</w:t>
+      </w:r>
+    </w:p>
+    <w:p>
+      <w:pPr>
+        <w:keepLines/>
+        <w:tabs>
+          <w:tab w:val="right" w:leader="dot" w:pos="9360"/>
+        </w:tabs>
+        <w:spacing w:before="144" w:after="0" w:line="276" w:lineRule="exact"/>
         <w:ind w:left="576" w:right="1320" w:hanging="576"/>
       </w:pPr>
       <w:r>
@@ -3777,63 +3974,63 @@
           <w:i/>
           <w:iCs/>
         </w:rPr>
-        <w:t xml:space="preserve">rel</w:t>
-      </w:r>
-      <w:r>
-        <w:rPr>
-          <w:i/>
-          <w:iCs/>
-        </w:rPr>
-        <w:t xml:space="preserve"> </w:t>
-      </w:r>
-      <w:r>
-        <w:rPr>
-          <w:i/>
-          <w:iCs/>
-        </w:rPr>
-        <w:t xml:space="preserve">Primecare</w:t>
-      </w:r>
-      <w:r>
-        <w:rPr>
-          <w:i/>
-          <w:iCs/>
-        </w:rPr>
-        <w:t xml:space="preserve"> </w:t>
-      </w:r>
-      <w:r>
-        <w:rPr>
-          <w:i/>
-          <w:iCs/>
-        </w:rPr>
-        <w:t xml:space="preserve">Med.</w:t>
-      </w:r>
-      <w:r>
-        <w:rPr>
-          <w:i/>
-          <w:iCs/>
-        </w:rPr>
-        <w:t xml:space="preserve"> </w:t>
-      </w:r>
-      <w:r>
-        <w:rPr>
-          <w:i/>
-          <w:iCs/>
-        </w:rPr>
-        <w:t xml:space="preserve">Of</w:t>
-      </w:r>
-      <w:r>
-        <w:rPr>
-          <w:i/>
-          <w:iCs/>
-        </w:rPr>
-        <w:t xml:space="preserve"> </w:t>
-      </w:r>
-      <w:r>
-        <w:rPr>
-          <w:i/>
-          <w:iCs/>
-        </w:rPr>
-        <w:t xml:space="preserve">W.Va.,</w:t>
+        <w:t xml:space="preserve">rel.</w:t>
+      </w:r>
+      <w:r>
+        <w:rPr>
+          <w:i/>
+          <w:iCs/>
+        </w:rPr>
+        <w:t xml:space="preserve"> </w:t>
+      </w:r>
+      <w:r>
+        <w:rPr>
+          <w:i/>
+          <w:iCs/>
+        </w:rPr>
+        <w:t xml:space="preserve">West</w:t>
+      </w:r>
+      <w:r>
+        <w:rPr>
+          <w:i/>
+          <w:iCs/>
+        </w:rPr>
+        <w:t xml:space="preserve"> </w:t>
+      </w:r>
+      <w:r>
+        <w:rPr>
+          <w:i/>
+          <w:iCs/>
+        </w:rPr>
+        <w:t xml:space="preserve">Virginia</w:t>
+      </w:r>
+      <w:r>
+        <w:rPr>
+          <w:i/>
+          <w:iCs/>
+        </w:rPr>
+        <w:t xml:space="preserve"> </w:t>
+      </w:r>
+      <w:r>
+        <w:rPr>
+          <w:i/>
+          <w:iCs/>
+        </w:rPr>
+        <w:t xml:space="preserve">University</w:t>
+      </w:r>
+      <w:r>
+        <w:rPr>
+          <w:i/>
+          <w:iCs/>
+        </w:rPr>
+        <w:t xml:space="preserve"> </w:t>
+      </w:r>
+      <w:r>
+        <w:rPr>
+          <w:i/>
+          <w:iCs/>
+        </w:rPr>
+        <w:t xml:space="preserve">Hospitals,</w:t>
       </w:r>
       <w:r>
         <w:rPr>
@@ -3875,7 +4072,7 @@
           <w:i/>
           <w:iCs/>
         </w:rPr>
-        <w:t xml:space="preserve">Faircloth</w:t>
+        <w:t xml:space="preserve">Scott</w:t>
       </w:r>
       <w:r>
         <w:t xml:space="preserve">,</w:t>
@@ -3884,7 +4081,7 @@
         <w:t xml:space="preserve"> </w:t>
       </w:r>
       <w:r>
-        <w:t xml:space="preserve">242</w:t>
+        <w:t xml:space="preserve">246</w:t>
       </w:r>
       <w:r>
         <w:t xml:space="preserve"> </w:t>
@@ -3896,13 +4093,13 @@
         <w:t xml:space="preserve"> </w:t>
       </w:r>
       <w:r>
-        <w:t xml:space="preserve">335,</w:t>
-      </w:r>
-      <w:r>
-        <w:t xml:space="preserve"> </w:t>
-      </w:r>
-      <w:r>
-        <w:t xml:space="preserve">835</w:t>
+        <w:t xml:space="preserve">184,</w:t>
+      </w:r>
+      <w:r>
+        <w:t xml:space="preserve"> </w:t>
+      </w:r>
+      <w:r>
+        <w:t xml:space="preserve">866</w:t>
       </w:r>
       <w:r>
         <w:t xml:space="preserve"> </w:t>
@@ -3914,13 +4111,13 @@
         <w:t xml:space="preserve"> </w:t>
       </w:r>
       <w:r>
-        <w:t xml:space="preserve">579</w:t>
-      </w:r>
-      <w:r>
-        <w:t xml:space="preserve"> </w:t>
-      </w:r>
-      <w:r>
-        <w:t xml:space="preserve">(2019)</w:t>
+        <w:t xml:space="preserve">350</w:t>
+      </w:r>
+      <w:r>
+        <w:t xml:space="preserve"> </w:t>
+      </w:r>
+      <w:r>
+        <w:t xml:space="preserve">(2021)</w:t>
       </w:r>
       <w:r>
         <w:t xml:space="preserve">   </w:t>
@@ -3929,7 +4126,7 @@
         <w:tab/>
       </w:r>
       <w:r>
-        <w:t xml:space="preserve">7, 11</w:t>
+        <w:t xml:space="preserve">10, 14, 18</w:t>
       </w:r>
     </w:p>
     <w:p>
@@ -3946,105 +4143,63 @@
           <w:i/>
           <w:iCs/>
         </w:rPr>
-        <w:t xml:space="preserve">State</w:t>
-      </w:r>
-      <w:r>
-        <w:rPr>
-          <w:i/>
-          <w:iCs/>
-        </w:rPr>
-        <w:t xml:space="preserve"> </w:t>
-      </w:r>
-      <w:r>
-        <w:rPr>
-          <w:i/>
-          <w:iCs/>
-        </w:rPr>
-        <w:t xml:space="preserve">ex</w:t>
-      </w:r>
-      <w:r>
-        <w:rPr>
-          <w:i/>
-          <w:iCs/>
-        </w:rPr>
-        <w:t xml:space="preserve"> </w:t>
-      </w:r>
-      <w:r>
-        <w:rPr>
-          <w:i/>
-          <w:iCs/>
-        </w:rPr>
-        <w:t xml:space="preserve">rel.</w:t>
-      </w:r>
-      <w:r>
-        <w:rPr>
-          <w:i/>
-          <w:iCs/>
-        </w:rPr>
-        <w:t xml:space="preserve"> </w:t>
-      </w:r>
-      <w:r>
-        <w:rPr>
-          <w:i/>
-          <w:iCs/>
-        </w:rPr>
-        <w:t xml:space="preserve">West</w:t>
-      </w:r>
-      <w:r>
-        <w:rPr>
-          <w:i/>
-          <w:iCs/>
-        </w:rPr>
-        <w:t xml:space="preserve"> </w:t>
-      </w:r>
-      <w:r>
-        <w:rPr>
-          <w:i/>
-          <w:iCs/>
-        </w:rPr>
-        <w:t xml:space="preserve">Virginia</w:t>
-      </w:r>
-      <w:r>
-        <w:rPr>
-          <w:i/>
-          <w:iCs/>
-        </w:rPr>
-        <w:t xml:space="preserve"> </w:t>
-      </w:r>
-      <w:r>
-        <w:rPr>
-          <w:i/>
-          <w:iCs/>
-        </w:rPr>
-        <w:t xml:space="preserve">University</w:t>
-      </w:r>
-      <w:r>
-        <w:rPr>
-          <w:i/>
-          <w:iCs/>
-        </w:rPr>
-        <w:t xml:space="preserve"> </w:t>
-      </w:r>
-      <w:r>
-        <w:rPr>
-          <w:i/>
-          <w:iCs/>
-        </w:rPr>
-        <w:t xml:space="preserve">Hospitals,</w:t>
-      </w:r>
-      <w:r>
-        <w:rPr>
-          <w:i/>
-          <w:iCs/>
-        </w:rPr>
-        <w:t xml:space="preserve"> </w:t>
-      </w:r>
-      <w:r>
-        <w:rPr>
-          <w:i/>
-          <w:iCs/>
-        </w:rPr>
-        <w:t xml:space="preserve">Inc.</w:t>
+        <w:t xml:space="preserve">W.</w:t>
+      </w:r>
+      <w:r>
+        <w:rPr>
+          <w:i/>
+          <w:iCs/>
+        </w:rPr>
+        <w:t xml:space="preserve"> </w:t>
+      </w:r>
+      <w:r>
+        <w:rPr>
+          <w:i/>
+          <w:iCs/>
+        </w:rPr>
+        <w:t xml:space="preserve">Va.</w:t>
+      </w:r>
+      <w:r>
+        <w:rPr>
+          <w:i/>
+          <w:iCs/>
+        </w:rPr>
+        <w:t xml:space="preserve"> </w:t>
+      </w:r>
+      <w:r>
+        <w:rPr>
+          <w:i/>
+          <w:iCs/>
+        </w:rPr>
+        <w:t xml:space="preserve">Dep’t</w:t>
+      </w:r>
+      <w:r>
+        <w:rPr>
+          <w:i/>
+          <w:iCs/>
+        </w:rPr>
+        <w:t xml:space="preserve"> </w:t>
+      </w:r>
+      <w:r>
+        <w:rPr>
+          <w:i/>
+          <w:iCs/>
+        </w:rPr>
+        <w:t xml:space="preserve">of</w:t>
+      </w:r>
+      <w:r>
+        <w:rPr>
+          <w:i/>
+          <w:iCs/>
+        </w:rPr>
+        <w:t xml:space="preserve"> </w:t>
+      </w:r>
+      <w:r>
+        <w:rPr>
+          <w:i/>
+          <w:iCs/>
+        </w:rPr>
+        <w:t xml:space="preserve">Health</w:t>
       </w:r>
       <w:r>
         <w:rPr>
@@ -4072,7 +4227,7 @@
           <w:i/>
           <w:iCs/>
         </w:rPr>
-        <w:t xml:space="preserve">Scott</w:t>
+        <w:t xml:space="preserve">Cipoletti</w:t>
       </w:r>
       <w:r>
         <w:t xml:space="preserve">,</w:t>
@@ -4081,7 +4236,7 @@
         <w:t xml:space="preserve"> </w:t>
       </w:r>
       <w:r>
-        <w:t xml:space="preserve">246</w:t>
+        <w:t xml:space="preserve">250</w:t>
       </w:r>
       <w:r>
         <w:t xml:space="preserve"> </w:t>
@@ -4093,13 +4248,13 @@
         <w:t xml:space="preserve"> </w:t>
       </w:r>
       <w:r>
-        <w:t xml:space="preserve">184,</w:t>
-      </w:r>
-      <w:r>
-        <w:t xml:space="preserve"> </w:t>
-      </w:r>
-      <w:r>
-        <w:t xml:space="preserve">866</w:t>
+        <w:t xml:space="preserve">1,</w:t>
+      </w:r>
+      <w:r>
+        <w:t xml:space="preserve"> </w:t>
+      </w:r>
+      <w:r>
+        <w:t xml:space="preserve">902</w:t>
       </w:r>
       <w:r>
         <w:t xml:space="preserve"> </w:t>
@@ -4111,13 +4266,13 @@
         <w:t xml:space="preserve"> </w:t>
       </w:r>
       <w:r>
-        <w:t xml:space="preserve">350</w:t>
-      </w:r>
-      <w:r>
-        <w:t xml:space="preserve"> </w:t>
-      </w:r>
-      <w:r>
-        <w:t xml:space="preserve">(2021)</w:t>
+        <w:t xml:space="preserve">133</w:t>
+      </w:r>
+      <w:r>
+        <w:t xml:space="preserve"> </w:t>
+      </w:r>
+      <w:r>
+        <w:t xml:space="preserve">(2024)</w:t>
       </w:r>
       <w:r>
         <w:t xml:space="preserve">   </w:t>
@@ -4126,7 +4281,23 @@
         <w:tab/>
       </w:r>
       <w:r>
-        <w:t xml:space="preserve">10, 14, 18</w:t>
+        <w:t xml:space="preserve">6, 12</w:t>
+      </w:r>
+    </w:p>
+    <w:p>
+      <w:pPr>
+        <w:keepNext/>
+        <w:keepLines/>
+        <w:spacing w:before="288" w:after="96" w:line="276" w:lineRule="exact"/>
+        <w:ind w:left="0" w:firstLine="0"/>
+        <w:jc w:val="left"/>
+      </w:pPr>
+      <w:r>
+        <w:rPr>
+          <w:b/>
+          <w:bCs/>
+        </w:rPr>
+        <w:t xml:space="preserve">STATUTES</w:t>
       </w:r>
     </w:p>
     <w:p>
@@ -4139,140 +4310,35 @@
         <w:ind w:left="576" w:right="1120" w:hanging="576"/>
       </w:pPr>
       <w:r>
-        <w:rPr>
-          <w:i/>
-          <w:iCs/>
-        </w:rPr>
         <w:t xml:space="preserve">W.</w:t>
       </w:r>
       <w:r>
-        <w:rPr>
-          <w:i/>
-          <w:iCs/>
-        </w:rPr>
-        <w:t xml:space="preserve"> </w:t>
-      </w:r>
-      <w:r>
-        <w:rPr>
-          <w:i/>
-          <w:iCs/>
-        </w:rPr>
+        <w:t xml:space="preserve"> </w:t>
+      </w:r>
+      <w:r>
         <w:t xml:space="preserve">Va.</w:t>
       </w:r>
       <w:r>
-        <w:rPr>
-          <w:i/>
-          <w:iCs/>
-        </w:rPr>
-        <w:t xml:space="preserve"> </w:t>
-      </w:r>
-      <w:r>
-        <w:rPr>
-          <w:i/>
-          <w:iCs/>
-        </w:rPr>
-        <w:t xml:space="preserve">Dep’t</w:t>
-      </w:r>
-      <w:r>
-        <w:rPr>
-          <w:i/>
-          <w:iCs/>
-        </w:rPr>
-        <w:t xml:space="preserve"> </w:t>
-      </w:r>
-      <w:r>
-        <w:rPr>
-          <w:i/>
-          <w:iCs/>
-        </w:rPr>
-        <w:t xml:space="preserve">of</w:t>
-      </w:r>
-      <w:r>
-        <w:rPr>
-          <w:i/>
-          <w:iCs/>
-        </w:rPr>
-        <w:t xml:space="preserve"> </w:t>
-      </w:r>
-      <w:r>
-        <w:rPr>
-          <w:i/>
-          <w:iCs/>
-        </w:rPr>
-        <w:t xml:space="preserve">Health</w:t>
-      </w:r>
-      <w:r>
-        <w:rPr>
-          <w:i/>
-          <w:iCs/>
-        </w:rPr>
-        <w:t xml:space="preserve"> </w:t>
-      </w:r>
-      <w:r>
-        <w:rPr>
-          <w:i/>
-          <w:iCs/>
-        </w:rPr>
-        <w:t xml:space="preserve">v.</w:t>
-      </w:r>
-      <w:r>
-        <w:rPr>
-          <w:i/>
-          <w:iCs/>
-        </w:rPr>
-        <w:t xml:space="preserve"> </w:t>
-      </w:r>
-      <w:r>
-        <w:rPr>
-          <w:i/>
-          <w:iCs/>
-        </w:rPr>
-        <w:t xml:space="preserve">Cipoletti</w:t>
-      </w:r>
-      <w:r>
-        <w:t xml:space="preserve">,</w:t>
-      </w:r>
-      <w:r>
-        <w:t xml:space="preserve"> </w:t>
-      </w:r>
-      <w:r>
-        <w:t xml:space="preserve">250</w:t>
-      </w:r>
-      <w:r>
-        <w:t xml:space="preserve"> </w:t>
-      </w:r>
-      <w:r>
-        <w:t xml:space="preserve">W.Va.</w:t>
-      </w:r>
-      <w:r>
-        <w:t xml:space="preserve"> </w:t>
-      </w:r>
-      <w:r>
-        <w:t xml:space="preserve">1,</w:t>
-      </w:r>
-      <w:r>
-        <w:t xml:space="preserve"> </w:t>
-      </w:r>
-      <w:r>
-        <w:t xml:space="preserve">902</w:t>
-      </w:r>
-      <w:r>
-        <w:t xml:space="preserve"> </w:t>
-      </w:r>
-      <w:r>
-        <w:t xml:space="preserve">S.E.2d</w:t>
-      </w:r>
-      <w:r>
-        <w:t xml:space="preserve"> </w:t>
-      </w:r>
-      <w:r>
-        <w:t xml:space="preserve">133</w:t>
-      </w:r>
-      <w:r>
-        <w:t xml:space="preserve"> </w:t>
-      </w:r>
-      <w:r>
-        <w:t xml:space="preserve">(2024)</w:t>
+        <w:t xml:space="preserve"> </w:t>
+      </w:r>
+      <w:r>
+        <w:t xml:space="preserve">Code</w:t>
+      </w:r>
+      <w:r>
+        <w:t xml:space="preserve"> </w:t>
+      </w:r>
+      <w:r>
+        <w:t xml:space="preserve">§</w:t>
+      </w:r>
+      <w:r>
+        <w:t xml:space="preserve"> </w:t>
+      </w:r>
+      <w:r>
+        <w:t xml:space="preserve">55</w:t>
+        <w:noBreakHyphen/>
+        <w:t xml:space="preserve">7B</w:t>
+        <w:noBreakHyphen/>
+        <w:t xml:space="preserve">6(a)</w:t>
       </w:r>
       <w:r>
         <w:t xml:space="preserve">   </w:t>
@@ -4281,23 +4347,7 @@
         <w:tab/>
       </w:r>
       <w:r>
-        <w:t xml:space="preserve">6, 12</w:t>
-      </w:r>
-    </w:p>
-    <w:p>
-      <w:pPr>
-        <w:keepNext/>
-        <w:keepLines/>
-        <w:spacing w:before="288" w:after="96" w:line="276" w:lineRule="exact"/>
-        <w:ind w:left="0" w:firstLine="0"/>
-        <w:jc w:val="left"/>
-      </w:pPr>
-      <w:r>
-        <w:rPr>
-          <w:b/>
-          <w:bCs/>
-        </w:rPr>
-        <w:t xml:space="preserve">STATUTES</w:t>
+        <w:t xml:space="preserve">10</w:t>
       </w:r>
     </w:p>
     <w:p>
@@ -4328,7 +4378,7 @@
         <w:t xml:space="preserve"> </w:t>
       </w:r>
       <w:r>
-        <w:t xml:space="preserve">§§</w:t>
+        <w:t xml:space="preserve">§</w:t>
       </w:r>
       <w:r>
         <w:t xml:space="preserve"> </w:t>
@@ -4338,19 +4388,7 @@
         <w:noBreakHyphen/>
         <w:t xml:space="preserve">7B</w:t>
         <w:noBreakHyphen/>
-        <w:t xml:space="preserve">1</w:t>
-      </w:r>
-      <w:r>
-        <w:t xml:space="preserve"> </w:t>
-      </w:r>
-      <w:r>
-        <w:t xml:space="preserve">et</w:t>
-      </w:r>
-      <w:r>
-        <w:t xml:space="preserve"> </w:t>
-      </w:r>
-      <w:r>
-        <w:t xml:space="preserve">seq.</w:t>
+        <w:t xml:space="preserve">6(b)</w:t>
       </w:r>
       <w:r>
         <w:t xml:space="preserve">   </w:t>
@@ -4359,7 +4397,7 @@
         <w:tab/>
       </w:r>
       <w:r>
-        <w:t xml:space="preserve">4</w:t>
+        <w:t xml:space="preserve">10, 22</w:t>
       </w:r>
     </w:p>
     <w:p>
@@ -4400,7 +4438,7 @@
         <w:noBreakHyphen/>
         <w:t xml:space="preserve">7B</w:t>
         <w:noBreakHyphen/>
-        <w:t xml:space="preserve">6(a)</w:t>
+        <w:t xml:space="preserve">6(b)⁠(D)</w:t>
       </w:r>
       <w:r>
         <w:t xml:space="preserve">   </w:t>
@@ -4409,7 +4447,7 @@
         <w:tab/>
       </w:r>
       <w:r>
-        <w:t xml:space="preserve">10</w:t>
+        <w:t xml:space="preserve">4, 23</w:t>
       </w:r>
     </w:p>
     <w:p>
@@ -4450,7 +4488,7 @@
         <w:noBreakHyphen/>
         <w:t xml:space="preserve">7B</w:t>
         <w:noBreakHyphen/>
-        <w:t xml:space="preserve">6(b)</w:t>
+        <w:t xml:space="preserve">6(f)</w:t>
       </w:r>
       <w:r>
         <w:t xml:space="preserve">   </w:t>
@@ -4459,7 +4497,7 @@
         <w:tab/>
       </w:r>
       <w:r>
-        <w:t xml:space="preserve">10, 22</w:t>
+        <w:t xml:space="preserve">11</w:t>
       </w:r>
     </w:p>
     <w:p>
@@ -4500,7 +4538,7 @@
         <w:noBreakHyphen/>
         <w:t xml:space="preserve">7B</w:t>
         <w:noBreakHyphen/>
-        <w:t xml:space="preserve">6(b)⁠(D)</w:t>
+        <w:t xml:space="preserve">9(g)</w:t>
       </w:r>
       <w:r>
         <w:t xml:space="preserve">   </w:t>
@@ -4509,7 +4547,7 @@
         <w:tab/>
       </w:r>
       <w:r>
-        <w:t xml:space="preserve">4, 23</w:t>
+        <w:t xml:space="preserve">3, 19</w:t>
       </w:r>
     </w:p>
     <w:p>
@@ -4540,7 +4578,7 @@
         <w:t xml:space="preserve"> </w:t>
       </w:r>
       <w:r>
-        <w:t xml:space="preserve">§</w:t>
+        <w:t xml:space="preserve">§§</w:t>
       </w:r>
       <w:r>
         <w:t xml:space="preserve"> </w:t>
@@ -4550,7 +4588,19 @@
         <w:noBreakHyphen/>
         <w:t xml:space="preserve">7B</w:t>
         <w:noBreakHyphen/>
-        <w:t xml:space="preserve">6(f)</w:t>
+        <w:t xml:space="preserve">1</w:t>
+      </w:r>
+      <w:r>
+        <w:t xml:space="preserve"> </w:t>
+      </w:r>
+      <w:r>
+        <w:t xml:space="preserve">et</w:t>
+      </w:r>
+      <w:r>
+        <w:t xml:space="preserve"> </w:t>
+      </w:r>
+      <w:r>
+        <w:t xml:space="preserve">seq.</w:t>
       </w:r>
       <w:r>
         <w:t xml:space="preserve">   </w:t>
@@ -4559,57 +4609,7 @@
         <w:tab/>
       </w:r>
       <w:r>
-        <w:t xml:space="preserve">11</w:t>
-      </w:r>
-    </w:p>
-    <w:p>
-      <w:pPr>
-        <w:keepLines/>
-        <w:tabs>
-          <w:tab w:val="right" w:leader="dot" w:pos="9360"/>
-        </w:tabs>
-        <w:spacing w:before="144" w:after="0" w:line="276" w:lineRule="exact"/>
-        <w:ind w:left="576" w:right="1120" w:hanging="576"/>
-      </w:pPr>
-      <w:r>
-        <w:t xml:space="preserve">W.</w:t>
-      </w:r>
-      <w:r>
-        <w:t xml:space="preserve"> </w:t>
-      </w:r>
-      <w:r>
-        <w:t xml:space="preserve">Va.</w:t>
-      </w:r>
-      <w:r>
-        <w:t xml:space="preserve"> </w:t>
-      </w:r>
-      <w:r>
-        <w:t xml:space="preserve">Code</w:t>
-      </w:r>
-      <w:r>
-        <w:t xml:space="preserve"> </w:t>
-      </w:r>
-      <w:r>
-        <w:t xml:space="preserve">§</w:t>
-      </w:r>
-      <w:r>
-        <w:t xml:space="preserve"> </w:t>
-      </w:r>
-      <w:r>
-        <w:t xml:space="preserve">55</w:t>
-        <w:noBreakHyphen/>
-        <w:t xml:space="preserve">7B</w:t>
-        <w:noBreakHyphen/>
-        <w:t xml:space="preserve">9(g)</w:t>
-      </w:r>
-      <w:r>
-        <w:t xml:space="preserve">   </w:t>
-      </w:r>
-      <w:r>
-        <w:tab/>
-      </w:r>
-      <w:r>
-        <w:t xml:space="preserve">3, 19</w:t>
+        <w:t xml:space="preserve">4</w:t>
       </w:r>
     </w:p>
     <w:p>
@@ -8185,7 +8185,7 @@
         <w:tab/>
       </w:r>
       <w:r>
-        <w:t xml:space="preserve">Five (5) notes were identified as being modified / edited as detailed in Informatics Nurse Michael Seaver’s Attachment 1. Earlier versions of the medical record were not produced so it is not possible to determine what edits and modifications were made. Depending on the nature of the edits and modifications made, it is possible that these edits and modifications do not comply with hospital administration and medical records standard of care for accurate, timely, and complete medical records…”</w:t>
+        <w:t xml:space="preserve">Five (5) notes were identified as being modified ⁠/ edited as detailed in Informatics Nurse Michael Seaver’s Attachment 1. Earlier versions of the medical record were not produced so it is not possible to determine what edits and modifications were made. Depending on the nature of the edits and modifications made, it is possible that these edits and modifications do not comply with hospital administration and medical records standard of care for accurate, timely, and complete medical records…”</w:t>
       </w:r>
     </w:p>
     <w:p>

</xml_diff>